<commit_message>
more data block size
</commit_message>
<xml_diff>
--- a/assignment-2/Gabriel Martinez.docx
+++ b/assignment-2/Gabriel Martinez.docx
@@ -385,6 +385,18 @@
       <w:r>
         <w:t xml:space="preserve">Takeaway, </w:t>
       </w:r>
+      <w:r>
+        <w:t xml:space="preserve">the naïve matrix multiple took ~3min to run on my computer and the </w:t>
+      </w:r>
+      <w:r>
+        <w:t xml:space="preserve">block </w:t>
+      </w:r>
+      <w:r>
+        <w:t>matrix</w:t>
+      </w:r>
+      <w:r>
+        <w:t xml:space="preserve"> multiply fastest block size of 32 took ~48seconds. </w:t>
+      </w:r>
     </w:p>
     <w:p>
       <w:pPr>
@@ -770,6 +782,71 @@
             </a:graphic>
           </wp:inline>
         </w:drawing>
+      </w:r>
+    </w:p>
+    <w:p>
+      <w:pPr>
+        <w:pStyle w:val="Heading3"/>
+      </w:pPr>
+      <w:r>
+        <w:lastRenderedPageBreak/>
+        <w:t>Block Size 256</w:t>
+      </w:r>
+    </w:p>
+    <w:p>
+      <w:r>
+        <w:rPr>
+          <w:noProof/>
+        </w:rPr>
+        <w:drawing>
+          <wp:inline distT="0" distB="0" distL="0" distR="0" wp14:anchorId="592F3146" wp14:editId="1BCCE1EB">
+            <wp:extent cx="5943600" cy="6212205"/>
+            <wp:effectExtent l="0" t="0" r="0" b="0"/>
+            <wp:docPr id="1745009478" name="Picture 9"/>
+            <wp:cNvGraphicFramePr>
+              <a:graphicFrameLocks xmlns:a="http://schemas.openxmlformats.org/drawingml/2006/main" noChangeAspect="1"/>
+            </wp:cNvGraphicFramePr>
+            <a:graphic xmlns:a="http://schemas.openxmlformats.org/drawingml/2006/main">
+              <a:graphicData uri="http://schemas.openxmlformats.org/drawingml/2006/picture">
+                <pic:pic xmlns:pic="http://schemas.openxmlformats.org/drawingml/2006/picture">
+                  <pic:nvPicPr>
+                    <pic:cNvPr id="1745009478" name="Picture 1745009478"/>
+                    <pic:cNvPicPr/>
+                  </pic:nvPicPr>
+                  <pic:blipFill>
+                    <a:blip r:embed="rId14">
+                      <a:extLst>
+                        <a:ext uri="{28A0092B-C50C-407E-A947-70E740481C1C}">
+                          <a14:useLocalDpi xmlns:a14="http://schemas.microsoft.com/office/drawing/2010/main" val="0"/>
+                        </a:ext>
+                      </a:extLst>
+                    </a:blip>
+                    <a:stretch>
+                      <a:fillRect/>
+                    </a:stretch>
+                  </pic:blipFill>
+                  <pic:spPr>
+                    <a:xfrm>
+                      <a:off x="0" y="0"/>
+                      <a:ext cx="5943600" cy="6212205"/>
+                    </a:xfrm>
+                    <a:prstGeom prst="rect">
+                      <a:avLst/>
+                    </a:prstGeom>
+                  </pic:spPr>
+                </pic:pic>
+              </a:graphicData>
+            </a:graphic>
+          </wp:inline>
+        </w:drawing>
+      </w:r>
+    </w:p>
+    <w:p>
+      <w:pPr>
+        <w:pStyle w:val="Heading3"/>
+      </w:pPr>
+      <w:r>
+        <w:t>Block Size 1024</w:t>
       </w:r>
     </w:p>
     <w:p/>
@@ -2330,7 +2407,7 @@
 </file>
 
 <file path=customXml/itemProps1.xml><?xml version="1.0" encoding="utf-8"?>
-<ds:datastoreItem xmlns:ds="http://schemas.openxmlformats.org/officeDocument/2006/customXml" ds:itemID="{9B71A02E-760C-2340-87AC-9A53CDF08E3B}">
+<ds:datastoreItem xmlns:ds="http://schemas.openxmlformats.org/officeDocument/2006/customXml" ds:itemID="{F6781834-4199-E448-B2FA-CC73065BBBA5}">
   <ds:schemaRefs>
     <ds:schemaRef ds:uri="http://schemas.openxmlformats.org/officeDocument/2006/bibliography"/>
   </ds:schemaRefs>

</xml_diff>

<commit_message>
unrolled loop slightly better
</commit_message>
<xml_diff>
--- a/assignment-2/Gabriel Martinez.docx
+++ b/assignment-2/Gabriel Martinez.docx
@@ -395,7 +395,95 @@
         <w:t>matrix</w:t>
       </w:r>
       <w:r>
-        <w:t xml:space="preserve"> multiply fastest block size of 32 took ~48seconds. </w:t>
+        <w:t xml:space="preserve"> multiply fastest block size of 32 took ~48seconds</w:t>
+      </w:r>
+      <w:r>
+        <w:t xml:space="preserve"> overall with </w:t>
+      </w:r>
+      <w:r>
+        <w:t>user ~46seconds and user ~.28secnds</w:t>
+      </w:r>
+      <w:r>
+        <w:t xml:space="preserve">. </w:t>
+      </w:r>
+      <w:r>
+        <w:t>According to Intel l</w:t>
+      </w:r>
+      <w:r>
+        <w:t>oop blocking (also known as loop tiling) is one of the most effective optimization techniques from the long list of possible loop optimizations you can apply to your code</w:t>
+      </w:r>
+      <w:r>
+        <w:t xml:space="preserve"> </w:t>
+      </w:r>
+      <w:sdt>
+        <w:sdtPr>
+          <w:id w:val="55215166"/>
+          <w:citation/>
+        </w:sdtPr>
+        <w:sdtContent>
+          <w:r>
+            <w:fldChar w:fldCharType="begin"/>
+          </w:r>
+          <w:r>
+            <w:instrText xml:space="preserve"> CITATION Int \l 1033 </w:instrText>
+          </w:r>
+          <w:r>
+            <w:fldChar w:fldCharType="separate"/>
+          </w:r>
+          <w:r>
+            <w:rPr>
+              <w:noProof/>
+            </w:rPr>
+            <w:t>[2]</w:t>
+          </w:r>
+          <w:r>
+            <w:fldChar w:fldCharType="end"/>
+          </w:r>
+        </w:sdtContent>
+      </w:sdt>
+      <w:r>
+        <w:t>.</w:t>
+      </w:r>
+      <w:r>
+        <w:t xml:space="preserve"> We change the </w:t>
+      </w:r>
+      <w:r>
+        <w:t xml:space="preserve">loop’s iteration space into smaller blocks </w:t>
+      </w:r>
+      <w:proofErr w:type="gramStart"/>
+      <w:r>
+        <w:t>in order to</w:t>
+      </w:r>
+      <w:proofErr w:type="gramEnd"/>
+      <w:r>
+        <w:t xml:space="preserve"> work with the memory hierarchy more efficiently</w:t>
+      </w:r>
+      <w:r>
+        <w:t xml:space="preserve"> in which we </w:t>
+      </w:r>
+      <w:r>
+        <w:t xml:space="preserve">can guarantee that the data used in the loop will fit the cache until it is reused. </w:t>
+      </w:r>
+      <w:r>
+        <w:t>This</w:t>
+      </w:r>
+      <w:r>
+        <w:t xml:space="preserve"> may significantly decrease the number of cache misses and improve the performance of </w:t>
+      </w:r>
+      <w:r>
+        <w:t>the</w:t>
+      </w:r>
+      <w:r>
+        <w:t xml:space="preserve"> application.</w:t>
+      </w:r>
+      <w:r>
+        <w:t xml:space="preserve"> The </w:t>
+      </w:r>
+      <w:r>
+        <w:t>Unrolled Block Matrix Multiply</w:t>
+      </w:r>
+      <w:r>
+        <w:t xml:space="preserve"> for block size 32 took ~48seconds overall</w:t>
       </w:r>
     </w:p>
     <w:p>
@@ -846,10 +934,58 @@
         <w:pStyle w:val="Heading3"/>
       </w:pPr>
       <w:r>
+        <w:lastRenderedPageBreak/>
         <w:t>Block Size 1024</w:t>
       </w:r>
     </w:p>
-    <w:p/>
+    <w:p>
+      <w:r>
+        <w:rPr>
+          <w:noProof/>
+        </w:rPr>
+        <w:drawing>
+          <wp:inline distT="0" distB="0" distL="0" distR="0" wp14:anchorId="2FE39D2B" wp14:editId="11D17EDC">
+            <wp:extent cx="5626100" cy="5969000"/>
+            <wp:effectExtent l="0" t="0" r="0" b="0"/>
+            <wp:docPr id="698463726" name="Picture 10"/>
+            <wp:cNvGraphicFramePr>
+              <a:graphicFrameLocks xmlns:a="http://schemas.openxmlformats.org/drawingml/2006/main" noChangeAspect="1"/>
+            </wp:cNvGraphicFramePr>
+            <a:graphic xmlns:a="http://schemas.openxmlformats.org/drawingml/2006/main">
+              <a:graphicData uri="http://schemas.openxmlformats.org/drawingml/2006/picture">
+                <pic:pic xmlns:pic="http://schemas.openxmlformats.org/drawingml/2006/picture">
+                  <pic:nvPicPr>
+                    <pic:cNvPr id="698463726" name="Picture 698463726"/>
+                    <pic:cNvPicPr/>
+                  </pic:nvPicPr>
+                  <pic:blipFill>
+                    <a:blip r:embed="rId15">
+                      <a:extLst>
+                        <a:ext uri="{28A0092B-C50C-407E-A947-70E740481C1C}">
+                          <a14:useLocalDpi xmlns:a14="http://schemas.microsoft.com/office/drawing/2010/main" val="0"/>
+                        </a:ext>
+                      </a:extLst>
+                    </a:blip>
+                    <a:stretch>
+                      <a:fillRect/>
+                    </a:stretch>
+                  </pic:blipFill>
+                  <pic:spPr>
+                    <a:xfrm>
+                      <a:off x="0" y="0"/>
+                      <a:ext cx="5626100" cy="5969000"/>
+                    </a:xfrm>
+                    <a:prstGeom prst="rect">
+                      <a:avLst/>
+                    </a:prstGeom>
+                  </pic:spPr>
+                </pic:pic>
+              </a:graphicData>
+            </a:graphic>
+          </wp:inline>
+        </w:drawing>
+      </w:r>
+    </w:p>
     <w:p/>
     <w:p>
       <w:pPr>
@@ -984,7 +1120,7 @@
           </w:tblGrid>
           <w:tr>
             <w:trPr>
-              <w:divId w:val="694574143"/>
+              <w:divId w:val="1703363236"/>
               <w:tblCellSpacing w:w="15" w:type="dxa"/>
             </w:trPr>
             <w:tc>
@@ -1030,10 +1166,56 @@
               </w:p>
             </w:tc>
           </w:tr>
+          <w:tr>
+            <w:trPr>
+              <w:divId w:val="1703363236"/>
+              <w:tblCellSpacing w:w="15" w:type="dxa"/>
+            </w:trPr>
+            <w:tc>
+              <w:tcPr>
+                <w:tcW w:w="50" w:type="pct"/>
+                <w:hideMark/>
+              </w:tcPr>
+              <w:p>
+                <w:pPr>
+                  <w:pStyle w:val="Bibliography"/>
+                  <w:rPr>
+                    <w:noProof/>
+                  </w:rPr>
+                </w:pPr>
+                <w:r>
+                  <w:rPr>
+                    <w:noProof/>
+                  </w:rPr>
+                  <w:t xml:space="preserve">[2] </w:t>
+                </w:r>
+              </w:p>
+            </w:tc>
+            <w:tc>
+              <w:tcPr>
+                <w:tcW w:w="0" w:type="auto"/>
+                <w:hideMark/>
+              </w:tcPr>
+              <w:p>
+                <w:pPr>
+                  <w:pStyle w:val="Bibliography"/>
+                  <w:rPr>
+                    <w:noProof/>
+                  </w:rPr>
+                </w:pPr>
+                <w:r>
+                  <w:rPr>
+                    <w:noProof/>
+                  </w:rPr>
+                  <w:t>Intel, "Loop Optimizations Where Blocks are Required," [Online]. Available: https://www.intel.com/content/www/us/en/developer/articles/technical/loop-optimizations-where-blocks-are-required.html?utm_source=chatgpt.com.</w:t>
+                </w:r>
+              </w:p>
+            </w:tc>
+          </w:tr>
         </w:tbl>
         <w:p>
           <w:pPr>
-            <w:divId w:val="694574143"/>
+            <w:divId w:val="1703363236"/>
             <w:rPr>
               <w:rFonts w:eastAsia="Times New Roman"/>
               <w:noProof/>
@@ -2403,11 +2585,24 @@
     <b:URL>https://clang.llvm.org/docs/LanguageExtensions.html#loop-unrolling</b:URL>
     <b:RefOrder>1</b:RefOrder>
   </b:Source>
+  <b:Source>
+    <b:Tag>Int</b:Tag>
+    <b:SourceType>InternetSite</b:SourceType>
+    <b:Guid>{A7633298-D701-7B4A-82E5-32B0A9B66AD0}</b:Guid>
+    <b:Author>
+      <b:Author>
+        <b:Corporate>Intel</b:Corporate>
+      </b:Author>
+    </b:Author>
+    <b:Title>Loop Optimizations Where Blocks are Required</b:Title>
+    <b:URL>https://www.intel.com/content/www/us/en/developer/articles/technical/loop-optimizations-where-blocks-are-required.html?utm_source=chatgpt.com</b:URL>
+    <b:RefOrder>2</b:RefOrder>
+  </b:Source>
 </b:Sources>
 </file>
 
 <file path=customXml/itemProps1.xml><?xml version="1.0" encoding="utf-8"?>
-<ds:datastoreItem xmlns:ds="http://schemas.openxmlformats.org/officeDocument/2006/customXml" ds:itemID="{F6781834-4199-E448-B2FA-CC73065BBBA5}">
+<ds:datastoreItem xmlns:ds="http://schemas.openxmlformats.org/officeDocument/2006/customXml" ds:itemID="{7FA8F15D-E887-7C43-8E19-F37100DF9696}">
   <ds:schemaRefs>
     <ds:schemaRef ds:uri="http://schemas.openxmlformats.org/officeDocument/2006/bibliography"/>
   </ds:schemaRefs>

</xml_diff>